<commit_message>
Consolida entrega validada com documentos e evidencias online
</commit_message>
<xml_diff>
--- a/docs/FinStart-3a-Entrega-Revisada.docx
+++ b/docs/FinStart-3a-Entrega-Revisada.docx
@@ -1414,7 +1414,7 @@
           <w:color w:val="000000"/>
           <w:sz w:val="24"/>
         </w:rPr>
-        <w:t>Concluído: fluxos do MVP, integração Express/API/JWT/MySQL, biblioteca ampliada, publicação HTTPS na Vercel e Render, banco na Aiven e código atualizado no GitHub. Em andamento: revisão final da entrega e apresentação. Pendentes: automação dos próximos deploys pelo GitHub, conferência visual completa em produção e envio no Canvas. O quadro anterior em docs/kanban.json registra a revisão local de 28/10; este parágrafo atualiza a situação de publicação.</w:t>
+        <w:t>Concluído: MVP integrado, publicação HTTPS, banco Aiven, testes visuais e mobile online, persistência após reinício da API e backup externo com restauração isolada. A Vercel publica automaticamente a cópia de Yuri no GitHub; o Render usa essa mesma origem, com atualização manual documentada. Pendentes: automação do Render por integração Git, revisão do grupo e envio no Canvas. O quadro anterior em docs/kanban.json registra a revisão local de 28/10; docs/VALIDACAO-FINAL.md registra esta rodada.</w:t>
       </w:r>
     </w:p>
     <w:p>
@@ -6706,18 +6706,8 @@
             </w:tcMar>
           </w:tcPr>
           <w:p>
-            <w:pPr>
-              <w:spacing w:after="60" w:before="60" w:line="240" w:lineRule="auto"/>
-              <w:jc w:val="left"/>
-            </w:pPr>
-            <w:r>
-              <w:rPr>
-                <w:rFonts w:ascii="Arial" w:hAnsi="Arial"/>
-                <w:b w:val="0"/>
-                <w:color w:val="000000"/>
-                <w:sz w:val="20"/>
-              </w:rPr>
-              <w:t>Oito páginas verificadas em 320, 390, 768 e 1280 px na revisão; biblioteca ampliada reconferida nessas larguras.</w:t>
+            <w:r>
+              <w:t>Oito páginas online em 320, 390, 768 e 1280 px; menu, tabelas e fluxos mobile verificados nesta rodada. Sem teste em aparelho físico.</w:t>
             </w:r>
           </w:p>
         </w:tc>
@@ -6910,7 +6900,7 @@
           <w:rFonts w:ascii="Arial" w:hAnsi="Arial"/>
           <w:sz w:val="24"/>
         </w:rPr>
-        <w:t>Passaram pelo domínio da Vercel: acesso público, conexão MySQL, cadastro, login, cookie Secure/HttpOnly/SameSite=Strict, cálculo de juros, gravação e consulta de orçamento/juros/metas, atualização e histórico de progresso, comparação e histórico, conteúdos, isolamento entre duas contas, logout e recuperação dos dados em novo login. Os registros financeiros de teste foram excluídos; duas contas fictícias permaneceram.</w:t>
+        <w:t>O script scripts/verificar-online.mjs foi executado novamente pelo domínio público após as atualizações. Passaram: saúde SQL, cadastro, login, cookie Secure/HttpOnly/SameSite=Strict, cálculos, gravação e consulta das ferramentas, progresso, comparação, isolamento entre contas, logout, recuperação em novo login e exclusão dos registros fictícios. Contas de teste permanecem; não se presume que existam somente duas. Dados inseridos posteriormente foram preservados.</w:t>
       </w:r>
     </w:p>
     <w:p>
@@ -6922,7 +6912,7 @@
           <w:rFonts w:ascii="Arial" w:hAnsi="Arial"/>
           <w:sz w:val="24"/>
         </w:rPr>
-        <w:t>Os caminhos /.env, /server/index.js e /database/schema.mysql.sql retornaram 404 no frontend. No navegador, o botão de projeção exibiu saldo de R$ 6.213,55. O teste HTTP não substitui a revisão de todos os formulários no navegador. Nesta publicação, ainda não foram testados todos os fluxos visuais/mobile nem a persistência após reinício do servidor. Os testes responsivos anteriores são evidências locais.</w:t>
+        <w:t>Na interface publicada, foram verificados cadastro, login, orçamento, projeção, meta, edição e histórico, comparação, biblioteca e exclusões. Playwright com Microsoft Edge verificou as oito páginas em 320, 390, 768 e 1280 px: sem transbordamento horizontal e sem erros JavaScript na rodada final. Menu mobile, gráficos e tabelas foram exercitados. O teste não representa uso em aparelho físico. Após reinício controlado da API às 23h23, a meta de R$ 6.000 com R$ 1.500 guardados foi recuperada em nova aba e recarga. Caminhos privados retornaram 404. Evidências: docs/evidencias/validacao-final/.</w:t>
       </w:r>
     </w:p>
     <w:p>
@@ -7114,7 +7104,7 @@
           <w:color w:val="000000"/>
           <w:sz w:val="24"/>
         </w:rPr>
-        <w:t>GitHub e ZIP preservam código, scripts SQL, testes e documentos. Não contêm contas reais, senhas ou uma cópia dos dados em nuvem. O banco online é independente do pacote de código. Os utilitários locais de backup permanecem disponíveis; a configuração e restauração de backup externo da Aiven ainda não foram verificadas nesta publicação.</w:t>
+        <w:t>GitHub e ZIP preservam código e documentos; não guardam os dados online. O painel Aiven confirmou Running no plano Free e mostrou um backup completo do provedor. Um dump externo com TLS VERIFY_IDENTITY foi restaurado em MySQL 8.0.45 local isolado; as dez tabelas coincidiram por contagem e hash. A instância temporária foi encerrada. Não houve restauração sobre a produção nem em outra Aiven 8.4. O dump privado fica separado do pacote público. Frequência, retenção externa e responsável pelos próximos backups estão documentados como manutenção.</w:t>
       </w:r>
     </w:p>
     <w:p>
@@ -7138,7 +7128,7 @@
           <w:color w:val="000000"/>
           <w:sz w:val="24"/>
         </w:rPr>
-        <w:t>O repositório oficial é https://github.com/enzocayresferreira7-pixel/finstart. O frontend foi publicado pela CLI a partir de pasta estática; a atualização automática por novos commits ainda precisa ser configurada e verificada. O plano gratuito do Render pode exigir espera no primeiro acesso após inatividade. O frontend aguarda até 90 segundos, sem repetir gravações automaticamente. Antes da apresentação, abrir o site e conferir /api/saude.</w:t>
+        <w:t>A pedido de Yuri, foi criada https://github.com/yurikikuchi2006/finstart, preservando o histórico da origem enzocayresferreira7-pixel/finstart. O projeto existente da Vercel foi conectado à cópia; novos commits dispararam deploys Ready no mesmo endereço público. O build seleciona 25 arquivos públicos para dist. O serviço Render existente também usa a cópia de Yuri, mantendo Node nativo, variáveis privadas e banco. Pela conexão de repositório público utilizada, seus próximos deploys são manuais; não se declara automação da API comprovada. O frontend mantém espera de 90 segundos, sem repetição de gravações.</w:t>
       </w:r>
     </w:p>
     <w:p>
@@ -7843,7 +7833,7 @@
           <w:color w:val="000000"/>
           <w:sz w:val="24"/>
         </w:rPr>
-        <w:t>Próximos passos: concluir deploy automático pelo GitHub; conferir todos os fluxos visuais e mobile em produção; testar persistência após reinício controlado da API; configurar e testar backup externo; recuperação de senha e verificação de e-mail; testes com usuários e acessibilidade assistiva; monitoramento e revisão periódica das fontes. Os cenários financeiros continuam hipotéticos.</w:t>
+        <w:t>Próximos passos: integrar o provedor Git ao Render para atualização automática; estabelecer retenção e rotina protegida de backups, repetindo a restauração em ambiente isolado; recuperação de senha e verificação de e-mail; testes com usuários e acessibilidade assistiva; monitoramento e revisão das fontes. Foram corrigidos os retornos de caminhos inexistentes por rotas 404 explícitas e o identificador de conteúdo da página Sobre, que causava erro JavaScript e prejudicava o link de salto. Os cenários financeiros continuam hipotéticos.</w:t>
       </w:r>
     </w:p>
     <w:p>
@@ -8549,7 +8539,7 @@
           <w:color w:val="000000"/>
           <w:sz w:val="24"/>
         </w:rPr>
-        <w:t>Pendências de entrega: revisão do documento pelo grupo, upload no Canvas e apresentação oral. Código e aplicação já estão publicados. Permanecem as verificações e melhorias descritas nas seções 6 a 8; testes finitos não garantem ausência de falhas nem substituem a avaliação do professor.</w:t>
+        <w:t>Pendências acadêmicas: revisão do grupo, upload no Canvas e apresentação oral. Código e aplicação estão publicados. As verificações desta rodada estão em docs/VALIDACAO-FINAL.md, com evidências separadas dos dados privados. Permanecem a automação do Render e as melhorias descritas na seção 8. Testes finitos não garantem ausência de falhas, disponibilidade futura dos provedores ou substituição da avaliação do professor.</w:t>
       </w:r>
     </w:p>
     <w:sectPr>

</xml_diff>

<commit_message>
Atualiza entrega final com autenticacao por email e validacao online
</commit_message>
<xml_diff>
--- a/docs/FinStart-3a-Entrega-Revisada.docx
+++ b/docs/FinStart-3a-Entrega-Revisada.docx
@@ -372,7 +372,7 @@
           <w:color w:val="000000"/>
           <w:sz w:val="24"/>
         </w:rPr>
-        <w:t>3ª entrega: consolidação da implementação. Atualização da publicação em 29/10/2026.</w:t>
+        <w:t>3ª entrega: consolidação da implementação. Publicação e autenticação por e-mail atualizadas em 30/10/2026.</w:t>
       </w:r>
     </w:p>
     <w:p>
@@ -722,7 +722,7 @@
           <w:color w:val="000000"/>
           <w:sz w:val="24"/>
         </w:rPr>
-        <w:t>Visitante: ler conteúdo → simular orçamento ou juros → comparar hipóteses. Conta autenticada: entrar → salvar simulação → criar ou editar meta → registrar saldo → consultar gráfico e painel. Os dados financeiros persistem no servidor; a preferência de filtro pode ficar no navegador.</w:t>
+        <w:t>Visitante: ler, simular e comparar hipóteses. Cadastro: informar dados, receber e confirmar código por e-mail. Login: validar senha e novo código; depois salvar simulações, editar metas e consultar históricos. Dados financeiros persistem no servidor; códigos não ficam no armazenamento do navegador.</w:t>
       </w:r>
     </w:p>
     <w:p>
@@ -1414,7 +1414,7 @@
           <w:color w:val="000000"/>
           <w:sz w:val="24"/>
         </w:rPr>
-        <w:t>Concluído: MVP integrado, publicação HTTPS, banco Aiven, testes visuais e mobile online, persistência após reinício da API e backup externo com restauração isolada. A Vercel publica automaticamente a cópia de Yuri no GitHub; o Render usa essa mesma origem, com atualização manual documentada. Pendentes: automação do Render por integração Git, revisão do grupo e envio no Canvas. O quadro anterior em docs/kanban.json registra a revisão local de 28/10; docs/VALIDACAO-FINAL.md registra esta rodada.</w:t>
+        <w:t>Concluído: MVP integrado, HTTPS, MySQL Aiven, testes online e mobile, persistência após reinício, backup restaurado em ambiente isolado e confirmação por e-mail no cadastro e login. Em 30/10, Yuri confirmou recebimento dos códigos e gravação/recuperação com o novo acesso. Vercel publica pelo GitHub; Render tem atualização manual documentada. Revisão do grupo e entrega no Canvas continuam sob responsabilidade acadêmica.</w:t>
       </w:r>
     </w:p>
     <w:p>
@@ -1656,18 +1656,8 @@
             </w:tcMar>
           </w:tcPr>
           <w:p>
-            <w:pPr>
-              <w:spacing w:after="60" w:before="60" w:line="240" w:lineRule="auto"/>
-              <w:jc w:val="left"/>
-            </w:pPr>
-            <w:r>
-              <w:rPr>
-                <w:rFonts w:ascii="Arial" w:hAnsi="Arial"/>
-                <w:b w:val="0"/>
-                <w:color w:val="000000"/>
-                <w:sz w:val="20"/>
-              </w:rPr>
-              <w:t>Cadastrar, autenticar e encerrar sessão: implementado.</w:t>
+            <w:r>
+              <w:t>Cadastrar e entrar com código por e-mail, encerrar sessão: implementado.</w:t>
             </w:r>
           </w:p>
         </w:tc>
@@ -2570,7 +2560,7 @@
           <w:color w:val="000000"/>
           <w:sz w:val="24"/>
         </w:rPr>
-        <w:t>As projeções não descontam inflação, taxas ou tributos. Recuperação de senha, verificação de e-mail, produtos reais e cotações não estão implementados. A hospedagem pública HTTPS já está disponível.</w:t>
+        <w:t>As projeções não descontam inflação, taxas ou tributos. Recuperação de senha, produtos reais e cotações não estão implementados. A confirmação por e-mail foi implementada no cadastro e em cada novo login. A publicação HTTPS está disponível.</w:t>
       </w:r>
     </w:p>
     <w:p>
@@ -2670,7 +2660,7 @@
           <w:color w:val="000000"/>
           <w:sz w:val="24"/>
         </w:rPr>
-        <w:t>server/index.js organiza as rotas; controllers.js executa as operações; auth.js trata autenticação; mysql.js e database.js oferecem persistência; dominio.js e financas.js concentram regras de cálculo. database/ reúne os scripts SQL, tests/ reúne verificações e docs/ contém relatório e evidências. Scripts de inicialização, configuração e backup são utilitários operacionais necessários.</w:t>
+        <w:t>server/index.js organiza rotas; controllers.js executa operações; auth.js trata sessões; verificacao-email.js gera e valida desafios; email.js envia pela API HTTPS do Brevo. mysql.js e database.js oferecem persistência; dominio.js e financas.js concentram cálculos. database/, tests/ e docs/ guardam SQL, testes e documentação.</w:t>
       </w:r>
     </w:p>
     <w:p>
@@ -2918,18 +2908,8 @@
             </w:tcMar>
           </w:tcPr>
           <w:p>
-            <w:pPr>
-              <w:spacing w:after="60" w:before="60" w:line="240" w:lineRule="auto"/>
-              <w:jc w:val="left"/>
-            </w:pPr>
-            <w:r>
-              <w:rPr>
-                <w:rFonts w:ascii="Arial" w:hAnsi="Arial"/>
-                <w:b w:val="0"/>
-                <w:color w:val="000000"/>
-                <w:sz w:val="20"/>
-              </w:rPr>
-              <w:t>Conta; email único e senha_hash. Pai de sessões, orçamentos, metas e juros.</w:t>
+            <w:r>
+              <w:t>Conta, email único, senha_hash e email_verificado_em; pai dos registros privados.</w:t>
             </w:r>
           </w:p>
         </w:tc>
@@ -3573,6 +3553,142 @@
           </w:p>
         </w:tc>
       </w:tr>
+      <w:tr>
+        <w:tc>
+          <w:tcPr>
+            <w:tcW w:type="dxa" w:w="3005"/>
+            <w:vAlign w:val="center"/>
+            <w:tcBorders>
+              <w:top w:val="single" w:sz="4" w:color="D9D9D9"/>
+              <w:left w:val="single" w:sz="4" w:color="D9D9D9"/>
+              <w:bottom w:val="single" w:sz="4" w:color="D9D9D9"/>
+              <w:right w:val="single" w:sz="4" w:color="D9D9D9"/>
+            </w:tcBorders>
+            <w:tcMar>
+              <w:top w:w="100" w:type="dxa"/>
+              <w:left w:w="100" w:type="dxa"/>
+              <w:bottom w:w="100" w:type="dxa"/>
+              <w:right w:w="100" w:type="dxa"/>
+            </w:tcMar>
+          </w:tcPr>
+          <w:p>
+            <w:pPr>
+              <w:spacing w:after="60" w:before="60" w:line="240" w:lineRule="auto"/>
+              <w:jc w:val="left"/>
+            </w:pPr>
+            <w:r>
+              <w:rPr>
+                <w:rFonts w:ascii="Arial" w:hAnsi="Arial"/>
+                <w:b w:val="0"/>
+                <w:color w:val="000000"/>
+                <w:sz w:val="20"/>
+              </w:rPr>
+              <w:t>desafios_email</w:t>
+            </w:r>
+          </w:p>
+        </w:tc>
+        <w:tc>
+          <w:tcPr>
+            <w:tcW w:type="dxa" w:w="5669"/>
+            <w:vAlign w:val="center"/>
+            <w:tcBorders>
+              <w:top w:val="single" w:sz="4" w:color="D9D9D9"/>
+              <w:left w:val="single" w:sz="4" w:color="D9D9D9"/>
+              <w:bottom w:val="single" w:sz="4" w:color="D9D9D9"/>
+              <w:right w:val="single" w:sz="4" w:color="D9D9D9"/>
+            </w:tcBorders>
+            <w:tcMar>
+              <w:top w:w="100" w:type="dxa"/>
+              <w:left w:w="100" w:type="dxa"/>
+              <w:bottom w:w="100" w:type="dxa"/>
+              <w:right w:w="100" w:type="dxa"/>
+            </w:tcMar>
+          </w:tcPr>
+          <w:p>
+            <w:pPr>
+              <w:spacing w:after="60" w:before="60" w:line="240" w:lineRule="auto"/>
+              <w:jc w:val="left"/>
+            </w:pPr>
+            <w:r>
+              <w:rPr>
+                <w:rFonts w:ascii="Arial" w:hAnsi="Arial"/>
+                <w:b w:val="0"/>
+                <w:color w:val="000000"/>
+                <w:sz w:val="20"/>
+              </w:rPr>
+              <w:t>Solicitação temporária, HMAC do código, validade e tentativas; usuario_id referencia usuarios no login.</w:t>
+            </w:r>
+          </w:p>
+        </w:tc>
+      </w:tr>
+      <w:tr>
+        <w:tc>
+          <w:tcPr>
+            <w:tcW w:type="dxa" w:w="3005"/>
+            <w:vAlign w:val="center"/>
+            <w:tcBorders>
+              <w:top w:val="single" w:sz="4" w:color="D9D9D9"/>
+              <w:left w:val="single" w:sz="4" w:color="D9D9D9"/>
+              <w:bottom w:val="single" w:sz="4" w:color="D9D9D9"/>
+              <w:right w:val="single" w:sz="4" w:color="D9D9D9"/>
+            </w:tcBorders>
+            <w:tcMar>
+              <w:top w:w="100" w:type="dxa"/>
+              <w:left w:w="100" w:type="dxa"/>
+              <w:bottom w:w="100" w:type="dxa"/>
+              <w:right w:w="100" w:type="dxa"/>
+            </w:tcMar>
+          </w:tcPr>
+          <w:p>
+            <w:pPr>
+              <w:spacing w:after="60" w:before="60" w:line="240" w:lineRule="auto"/>
+              <w:jc w:val="left"/>
+            </w:pPr>
+            <w:r>
+              <w:rPr>
+                <w:rFonts w:ascii="Arial" w:hAnsi="Arial"/>
+                <w:b w:val="0"/>
+                <w:color w:val="000000"/>
+                <w:sz w:val="20"/>
+              </w:rPr>
+              <w:t>email_limites</w:t>
+            </w:r>
+          </w:p>
+        </w:tc>
+        <w:tc>
+          <w:tcPr>
+            <w:tcW w:type="dxa" w:w="5669"/>
+            <w:vAlign w:val="center"/>
+            <w:tcBorders>
+              <w:top w:val="single" w:sz="4" w:color="D9D9D9"/>
+              <w:left w:val="single" w:sz="4" w:color="D9D9D9"/>
+              <w:bottom w:val="single" w:sz="4" w:color="D9D9D9"/>
+              <w:right w:val="single" w:sz="4" w:color="D9D9D9"/>
+            </w:tcBorders>
+            <w:tcMar>
+              <w:top w:w="100" w:type="dxa"/>
+              <w:left w:w="100" w:type="dxa"/>
+              <w:bottom w:w="100" w:type="dxa"/>
+              <w:right w:w="100" w:type="dxa"/>
+            </w:tcMar>
+          </w:tcPr>
+          <w:p>
+            <w:pPr>
+              <w:spacing w:after="60" w:before="60" w:line="240" w:lineRule="auto"/>
+              <w:jc w:val="left"/>
+            </w:pPr>
+            <w:r>
+              <w:rPr>
+                <w:rFonts w:ascii="Arial" w:hAnsi="Arial"/>
+                <w:b w:val="0"/>
+                <w:color w:val="000000"/>
+                <w:sz w:val="20"/>
+              </w:rPr>
+              <w:t>Cotas persistentes por endereço e janela global; chave derivada por HMAC.</w:t>
+            </w:r>
+          </w:p>
+        </w:tc>
+      </w:tr>
     </w:tbl>
     <w:p>
       <w:pPr>
@@ -3618,7 +3734,7 @@
           <w:color w:val="000000"/>
           <w:sz w:val="24"/>
         </w:rPr>
-        <w:t>O catálogo físico contém 10 tabelas, 8 chaves estrangeiras e 51 colunas. Há chaves primárias, unicidade, checks e exclusão em cascata nas relações de propriedade. O script executável é database/schema.mysql.sql; database/consultas-demonstracao.mysql.sql permite inspecionar tabelas, colunas e relacionamentos sem alterar registros.</w:t>
+        <w:t>O catálogo físico atual contém 12 tabelas, 9 chaves estrangeiras e 66 colunas. usuarios ganhou email_verificado_em; desafios_email guarda solicitações temporárias e email_limites mantém cotas. A migração adiciona estruturas sem apagar registros. database/schema.mysql.sql é executável; consultas-demonstracao.mysql.sql permite inspecionar o esquema.</w:t>
       </w:r>
     </w:p>
     <w:p>
@@ -3666,7 +3782,7 @@
           <w:color w:val="000000"/>
           <w:sz w:val="24"/>
         </w:rPr>
-        <w:t>As entidades usuario e meta usam os nomes físicos usuarios e metas. A projeção planejada como simulacao é armazenada em juros, enquanto simulacoes identifica o orçamento. As entidades categoria, conteudo, tipo_investimento, simulacao_investimento e progresso_meta foram implementadas. Sessões e orçamento complementam as oito entidades do planejamento. Novos atributos operacionais incluem prazo, status e referências do conteúdo; nascimento foi omitido por minimização de dados.</w:t>
+        <w:t>usuario e meta do planejamento correspondem a usuarios e metas. A projeção é armazenada em juros; simulacoes guarda orçamentos. Categoria, conteúdo, tipos, comparação e progresso foram implementados. Sessões e orçamento complementam as entidades iniciais; desafios de e-mail e limites foram acrescentados nesta revisão. Nascimento não é coletado.</w:t>
       </w:r>
     </w:p>
     <w:p>
@@ -3745,7 +3861,7 @@
       <w:pPr>
         <w:keepNext/>
         <w:keepLines w:val="0"/>
-        <w:pageBreakBefore/>
+        <w:pageBreakBefore w:val="0"/>
         <w:widowControl/>
         <w:spacing w:before="100" w:beforeAutospacing="1" w:after="100" w:afterAutospacing="1" w:line="240" w:lineRule="auto"/>
         <w:ind w:left="0" w:firstLine="0"/>
@@ -4047,18 +4163,8 @@
             </w:tcMar>
           </w:tcPr>
           <w:p>
-            <w:pPr>
-              <w:spacing w:after="60" w:before="60" w:line="240" w:lineRule="auto"/>
-              <w:jc w:val="left"/>
-            </w:pPr>
-            <w:r>
-              <w:rPr>
-                <w:rFonts w:ascii="Arial" w:hAnsi="Arial"/>
-                <w:b w:val="0"/>
-                <w:color w:val="000000"/>
-                <w:sz w:val="20"/>
-              </w:rPr>
-              <w:t>Criação de conta e autenticação.</w:t>
+            <w:r>
+              <w:t>Inicia desafio por e-mail; retorna 202 sem sessão.</w:t>
             </w:r>
           </w:p>
         </w:tc>
@@ -4560,6 +4666,210 @@
           </w:p>
         </w:tc>
       </w:tr>
+      <w:tr>
+        <w:tc>
+          <w:tcPr>
+            <w:tcW w:type="dxa" w:w="3969"/>
+            <w:vAlign w:val="center"/>
+            <w:tcBorders>
+              <w:top w:val="single" w:sz="4" w:color="D9D9D9"/>
+              <w:left w:val="single" w:sz="4" w:color="D9D9D9"/>
+              <w:bottom w:val="single" w:sz="4" w:color="D9D9D9"/>
+              <w:right w:val="single" w:sz="4" w:color="D9D9D9"/>
+            </w:tcBorders>
+            <w:tcMar>
+              <w:top w:w="100" w:type="dxa"/>
+              <w:left w:w="100" w:type="dxa"/>
+              <w:bottom w:w="100" w:type="dxa"/>
+              <w:right w:w="100" w:type="dxa"/>
+            </w:tcMar>
+          </w:tcPr>
+          <w:p>
+            <w:pPr>
+              <w:spacing w:after="60" w:before="60" w:line="240" w:lineRule="auto"/>
+              <w:jc w:val="left"/>
+            </w:pPr>
+            <w:r>
+              <w:rPr>
+                <w:rFonts w:ascii="Arial" w:hAnsi="Arial"/>
+                <w:b w:val="0"/>
+                <w:color w:val="000000"/>
+                <w:sz w:val="20"/>
+              </w:rPr>
+              <w:t>GET /api/auth-config</w:t>
+            </w:r>
+          </w:p>
+        </w:tc>
+        <w:tc>
+          <w:tcPr>
+            <w:tcW w:type="dxa" w:w="4706"/>
+            <w:vAlign w:val="center"/>
+            <w:tcBorders>
+              <w:top w:val="single" w:sz="4" w:color="D9D9D9"/>
+              <w:left w:val="single" w:sz="4" w:color="D9D9D9"/>
+              <w:bottom w:val="single" w:sz="4" w:color="D9D9D9"/>
+              <w:right w:val="single" w:sz="4" w:color="D9D9D9"/>
+            </w:tcBorders>
+            <w:tcMar>
+              <w:top w:w="100" w:type="dxa"/>
+              <w:left w:w="100" w:type="dxa"/>
+              <w:bottom w:w="100" w:type="dxa"/>
+              <w:right w:w="100" w:type="dxa"/>
+            </w:tcMar>
+          </w:tcPr>
+          <w:p>
+            <w:pPr>
+              <w:spacing w:after="60" w:before="60" w:line="240" w:lineRule="auto"/>
+              <w:jc w:val="left"/>
+            </w:pPr>
+            <w:r>
+              <w:rPr>
+                <w:rFonts w:ascii="Arial" w:hAnsi="Arial"/>
+                <w:b w:val="0"/>
+                <w:color w:val="000000"/>
+                <w:sz w:val="20"/>
+              </w:rPr>
+              <w:t>Informa se a confirmação está ativa.</w:t>
+            </w:r>
+          </w:p>
+        </w:tc>
+      </w:tr>
+      <w:tr>
+        <w:tc>
+          <w:tcPr>
+            <w:tcW w:type="dxa" w:w="3969"/>
+            <w:vAlign w:val="center"/>
+            <w:tcBorders>
+              <w:top w:val="single" w:sz="4" w:color="D9D9D9"/>
+              <w:left w:val="single" w:sz="4" w:color="D9D9D9"/>
+              <w:bottom w:val="single" w:sz="4" w:color="D9D9D9"/>
+              <w:right w:val="single" w:sz="4" w:color="D9D9D9"/>
+            </w:tcBorders>
+            <w:tcMar>
+              <w:top w:w="100" w:type="dxa"/>
+              <w:left w:w="100" w:type="dxa"/>
+              <w:bottom w:w="100" w:type="dxa"/>
+              <w:right w:w="100" w:type="dxa"/>
+            </w:tcMar>
+          </w:tcPr>
+          <w:p>
+            <w:pPr>
+              <w:spacing w:after="60" w:before="60" w:line="240" w:lineRule="auto"/>
+              <w:jc w:val="left"/>
+            </w:pPr>
+            <w:r>
+              <w:rPr>
+                <w:rFonts w:ascii="Arial" w:hAnsi="Arial"/>
+                <w:b w:val="0"/>
+                <w:color w:val="000000"/>
+                <w:sz w:val="20"/>
+              </w:rPr>
+              <w:t>POST /api/confirmar-email</w:t>
+            </w:r>
+          </w:p>
+        </w:tc>
+        <w:tc>
+          <w:tcPr>
+            <w:tcW w:type="dxa" w:w="4706"/>
+            <w:vAlign w:val="center"/>
+            <w:tcBorders>
+              <w:top w:val="single" w:sz="4" w:color="D9D9D9"/>
+              <w:left w:val="single" w:sz="4" w:color="D9D9D9"/>
+              <w:bottom w:val="single" w:sz="4" w:color="D9D9D9"/>
+              <w:right w:val="single" w:sz="4" w:color="D9D9D9"/>
+            </w:tcBorders>
+            <w:tcMar>
+              <w:top w:w="100" w:type="dxa"/>
+              <w:left w:w="100" w:type="dxa"/>
+              <w:bottom w:w="100" w:type="dxa"/>
+              <w:right w:w="100" w:type="dxa"/>
+            </w:tcMar>
+          </w:tcPr>
+          <w:p>
+            <w:pPr>
+              <w:spacing w:after="60" w:before="60" w:line="240" w:lineRule="auto"/>
+              <w:jc w:val="left"/>
+            </w:pPr>
+            <w:r>
+              <w:rPr>
+                <w:rFonts w:ascii="Arial" w:hAnsi="Arial"/>
+                <w:b w:val="0"/>
+                <w:color w:val="000000"/>
+                <w:sz w:val="20"/>
+              </w:rPr>
+              <w:t>Valida código, consome desafio e abre sessão.</w:t>
+            </w:r>
+          </w:p>
+        </w:tc>
+      </w:tr>
+      <w:tr>
+        <w:tc>
+          <w:tcPr>
+            <w:tcW w:type="dxa" w:w="3969"/>
+            <w:vAlign w:val="center"/>
+            <w:tcBorders>
+              <w:top w:val="single" w:sz="4" w:color="D9D9D9"/>
+              <w:left w:val="single" w:sz="4" w:color="D9D9D9"/>
+              <w:bottom w:val="single" w:sz="4" w:color="D9D9D9"/>
+              <w:right w:val="single" w:sz="4" w:color="D9D9D9"/>
+            </w:tcBorders>
+            <w:tcMar>
+              <w:top w:w="100" w:type="dxa"/>
+              <w:left w:w="100" w:type="dxa"/>
+              <w:bottom w:w="100" w:type="dxa"/>
+              <w:right w:w="100" w:type="dxa"/>
+            </w:tcMar>
+          </w:tcPr>
+          <w:p>
+            <w:pPr>
+              <w:spacing w:after="60" w:before="60" w:line="240" w:lineRule="auto"/>
+              <w:jc w:val="left"/>
+            </w:pPr>
+            <w:r>
+              <w:rPr>
+                <w:rFonts w:ascii="Arial" w:hAnsi="Arial"/>
+                <w:b w:val="0"/>
+                <w:color w:val="000000"/>
+                <w:sz w:val="20"/>
+              </w:rPr>
+              <w:t>POST /api/reenviar-codigo</w:t>
+            </w:r>
+          </w:p>
+        </w:tc>
+        <w:tc>
+          <w:tcPr>
+            <w:tcW w:type="dxa" w:w="4706"/>
+            <w:vAlign w:val="center"/>
+            <w:tcBorders>
+              <w:top w:val="single" w:sz="4" w:color="D9D9D9"/>
+              <w:left w:val="single" w:sz="4" w:color="D9D9D9"/>
+              <w:bottom w:val="single" w:sz="4" w:color="D9D9D9"/>
+              <w:right w:val="single" w:sz="4" w:color="D9D9D9"/>
+            </w:tcBorders>
+            <w:tcMar>
+              <w:top w:w="100" w:type="dxa"/>
+              <w:left w:w="100" w:type="dxa"/>
+              <w:bottom w:w="100" w:type="dxa"/>
+              <w:right w:w="100" w:type="dxa"/>
+            </w:tcMar>
+          </w:tcPr>
+          <w:p>
+            <w:pPr>
+              <w:spacing w:after="60" w:before="60" w:line="240" w:lineRule="auto"/>
+              <w:jc w:val="left"/>
+            </w:pPr>
+            <w:r>
+              <w:rPr>
+                <w:rFonts w:ascii="Arial" w:hAnsi="Arial"/>
+                <w:b w:val="0"/>
+                <w:color w:val="000000"/>
+                <w:sz w:val="20"/>
+              </w:rPr>
+              <w:t>Reenvio explícito com intervalo e cotas.</w:t>
+            </w:r>
+          </w:p>
+        </w:tc>
+      </w:tr>
     </w:tbl>
     <w:p>
       <w:pPr>
@@ -4605,7 +4915,7 @@
           <w:color w:val="000000"/>
           <w:sz w:val="24"/>
         </w:rPr>
-        <w:t>Senhas usam scrypt com salt. JWT possui assinatura HS256, expiração e verificação no servidor, associado a sessão revogável. O cookie é HttpOnly e SameSite=Strict, com Secure em produção. Consultas parametrizadas e filtros por proprietário protegem os registros. A API limita corpo e tentativas de autenticação e valida entradas e origem.</w:t>
+        <w:t>Senhas usam scrypt com salt. JWT assinado e expirável é associado a sessão revogável; cookie HttpOnly, SameSite=Strict e Secure em produção. O código de seis dígitos expira em dez minutos, admite cinco erros e só pode ser consumido uma vez. Reenvio tem intervalo mínimo de sessenta segundos e invalida o anterior. Há cotas persistentes por endereço e por dia. Somente o servidor gera e valida o código; guarda HMAC, sem texto puro.</w:t>
       </w:r>
     </w:p>
     <w:p>
@@ -4653,7 +4963,7 @@
           <w:color w:val="000000"/>
           <w:sz w:val="24"/>
         </w:rPr>
-        <w:t>Cadastro: formulário → validação e hash → INSERT usuarios. Login: verificação da senha → sessão/JWT → cookie. Meta: formulário autenticado → UPDATE metas e INSERT progresso_meta na mesma transação → consulta do histórico → gráfico/tabela. Comparação: cálculo dos cenários → INSERT juros e resultados associados → consulta no painel.</w:t>
+        <w:t>Cadastro: validação e hash, desafio temporário, envio Brevo, confirmação do código e INSERT usuarios; só então sessão e cookie. Login: senha válida, novo desafio por e-mail e cookie apenas após confirmação. Meta: UPDATE metas e INSERT progresso_meta na mesma transação, seguido de gráfico/tabela. Comparação: cálculo, INSERT juros e resultados associados, depois consulta no painel.</w:t>
       </w:r>
     </w:p>
     <w:p>
@@ -6138,7 +6448,7 @@
           <w:color w:val="000000"/>
           <w:sz w:val="24"/>
         </w:rPr>
-        <w:t>A revisão local de 28/10 registrou dez testes aprovados e integração MySQL separada. Na preparação de produção, a suíte registrou 11 testes aprovados e um teste MySQL opcional ignorado. Em 29/10, scripts/verificar-online.mjs foi executado contra o domínio público da Vercel, exercitando proxy, API e MySQL reais com contas fictícias. Os resultados abaixo distinguem a verificação local das evidências online; não constituem auditoria completa de segurança.</w:t>
+        <w:t>A suíte com a confirmação por e-mail registrou 20 testes aprovados e um MySQL opcional ignorado; a integração MySQL foi executada e aprovada separadamente em ambiente isolado. Os nove testes de e-mail foram repetidos após a melhoria visual e passaram. Cobrem expiração, cinco erros, reenvio, falha do provedor, limites, persistência e consumo concorrente único. Os testes finitos não constituem auditoria completa de segurança.</w:t>
       </w:r>
     </w:p>
     <w:tbl>
@@ -6280,18 +6590,8 @@
             </w:tcMar>
           </w:tcPr>
           <w:p>
-            <w:pPr>
-              <w:spacing w:after="60" w:before="60" w:line="240" w:lineRule="auto"/>
-              <w:jc w:val="left"/>
-            </w:pPr>
-            <w:r>
-              <w:rPr>
-                <w:rFonts w:ascii="Arial" w:hAnsi="Arial"/>
-                <w:b w:val="0"/>
-                <w:color w:val="000000"/>
-                <w:sz w:val="20"/>
-              </w:rPr>
-              <w:t>Cadastro/login/logout, JWT e isolamento entre contas aprovados.</w:t>
+            <w:r>
+              <w:t>API local aprovada; cadastro/login por e-mail e recuperação online confirmados por Yuri em 30/10.</w:t>
             </w:r>
           </w:p>
         </w:tc>
@@ -6888,7 +7188,7 @@
           <w:rFonts w:ascii="Arial" w:hAnsi="Arial"/>
           <w:sz w:val="24"/>
         </w:rPr>
-        <w:t>Verificação da publicação em 29/10/2026</w:t>
+        <w:t>Verificação online em 29 e 30/10/2026</w:t>
       </w:r>
     </w:p>
     <w:p>
@@ -6900,7 +7200,7 @@
           <w:rFonts w:ascii="Arial" w:hAnsi="Arial"/>
           <w:sz w:val="24"/>
         </w:rPr>
-        <w:t>O script scripts/verificar-online.mjs foi executado novamente pelo domínio público após as atualizações. Passaram: saúde SQL, cadastro, login, cookie Secure/HttpOnly/SameSite=Strict, cálculos, gravação e consulta das ferramentas, progresso, comparação, isolamento entre contas, logout, recuperação em novo login e exclusão dos registros fictícios. Contas de teste permanecem; não se presume que existam somente duas. Dados inseridos posteriormente foram preservados.</w:t>
+        <w:t>Em 29/10, o script online aprovou saúde SQL, cadastro/login anteriores, cookie protegido, ferramentas, isolamento, logout e recuperação. Após ativar a confirmação por e-mail em 30/10, Yuri confirmou pelo site o recebimento no cadastro e login, além de salvar e recuperar os dados com esse acesso. Esse resultado é confirmação manual do usuário; o script evita enviar mensagens a contas fictícias quando a etapa está ativa.</w:t>
       </w:r>
     </w:p>
     <w:p>
@@ -7008,7 +7308,7 @@
           <w:color w:val="000000"/>
           <w:sz w:val="24"/>
         </w:rPr>
-        <w:t>A apresentação utiliza https://finstart-publicacao.vercel.app. Basta internet e navegador; não é necessário instalar Node.js, MySQL ou abrir terminal no computador do professor. O frontend está na Vercel, a API em https://finstart-api-l60v.onrender.com e o banco persistente na Aiven. GET /api/saude pelo domínio do site confirmou banco conectado em 29/10/2026.</w:t>
+        <w:t>A apresentação usa https://finstart-publicacao.vercel.app, com internet e navegador. Vercel hospeda a interface; Render executa a API em https://finstart-api-l60v.onrender.com; Aiven mantém o MySQL. Em 30/10, /api/saude retornou status ok e banco conectado; /api/auth-config confirmou a verificação por e-mail ativa. Brevo entrega as mensagens, sem receber os dados financeiros.</w:t>
       </w:r>
     </w:p>
     <w:p>
@@ -7056,7 +7356,7 @@
           <w:color w:val="000000"/>
           <w:sz w:val="24"/>
         </w:rPr>
-        <w:t>No Render, NODE_ENV=production, DB_DRIVER=mysql e DB_SSL=true identificam a configuração. DB_HOST, DB_PORT, DB_NAME, DB_USER, DB_PASSWORD, DB_SSL_CA e JWT_SECRET ficam nas variáveis privadas. Nenhuma senha deve ser mostrada na apresentação ou incluída no ZIP. O Workbench é opcional para inspeção autorizada do banco; abrir um arquivo SQL sozinho apenas mostra o código.</w:t>
+        <w:t>No Render, DB_DRIVER=mysql e DB_SSL=true selecionam o banco; credenciais SQL, certificado CA, JWT_SECRET e BREVO_API_KEY ficam privados. EMAIL_OTP_ENABLED=true exige a etapa e EMAIL_FROM identifica o remetente. O envio usa HTTPS. O e-mail inclui logo, texto maior, código em negrito e alternativa de texto simples. A imagem na bolinha do remetente depende do provedor e de domínio autenticado; não é controlada pelo HTML.</w:t>
       </w:r>
     </w:p>
     <w:p>
@@ -7104,7 +7404,7 @@
           <w:color w:val="000000"/>
           <w:sz w:val="24"/>
         </w:rPr>
-        <w:t>GitHub e ZIP preservam código e documentos; não guardam os dados online. O painel Aiven confirmou Running no plano Free e mostrou um backup completo do provedor. Um dump externo com TLS VERIFY_IDENTITY foi restaurado em MySQL 8.0.45 local isolado; as dez tabelas coincidiram por contagem e hash. A instância temporária foi encerrada. Não houve restauração sobre a produção nem em outra Aiven 8.4. O dump privado fica separado do pacote público. Frequência, retenção externa e responsável pelos próximos backups estão documentados como manutenção.</w:t>
+        <w:t>O backup externo de 29/10, anterior à migração de e-mail, foi restaurado em MySQL 8.0.45 local isolado: as dez tabelas daquela versão coincidiram por contagem e hash. Esse teste não comprova um backup atual das doze tabelas. A migração nova foi testada separadamente sem perda dos registros anteriores. Dumps com dados de contas ficam privados e separados do ZIP e GitHub. A manutenção deve gerar novos backups e repetir a restauração isolada.</w:t>
       </w:r>
     </w:p>
     <w:p>
@@ -7833,7 +8133,7 @@
           <w:color w:val="000000"/>
           <w:sz w:val="24"/>
         </w:rPr>
-        <w:t>Próximos passos: integrar o provedor Git ao Render para atualização automática; estabelecer retenção e rotina protegida de backups, repetindo a restauração em ambiente isolado; recuperação de senha e verificação de e-mail; testes com usuários e acessibilidade assistiva; monitoramento e revisão das fontes. Foram corrigidos os retornos de caminhos inexistentes por rotas 404 explícitas e o identificador de conteúdo da página Sobre, que causava erro JavaScript e prejudicava o link de salto. Os cenários financeiros continuam hipotéticos.</w:t>
+        <w:t>Próximos passos: recuperação de senha; integração Git do Render para deploy automático; rotina e retenção de backups atuais; acessibilidade assistiva e testes com usuários; monitoramento e revisão das fontes. A confirmação por e-mail já está implementada. Caminhos inexistentes foram corrigidos para 404 e o identificador principal de Sobre foi corrigido. Os cenários financeiros permanecem hipotéticos.</w:t>
       </w:r>
     </w:p>
     <w:p>
@@ -8491,7 +8791,7 @@
           <w:color w:val="000000"/>
           <w:sz w:val="24"/>
         </w:rPr>
-        <w:t>Documentação técnica: Node.js (https://nodejs.org/docs/latest-v24.x/api/), Express (https://expressjs.com/), MySQL (https://dev.mysql.com/doc/refman/8.0/en/) e SQLite (https://www.sqlite.org/).</w:t>
+        <w:t>Documentação técnica: Node.js (nodejs.org/docs/latest-v24.x/api/), Express (expressjs.com), MySQL (dev.mysql.com/doc/refman/8.0/en/), SQLite (sqlite.org), API transacional Brevo (developers.brevo.com/docs/send-a-transactional-email) e hospedagem gratuita Render (render.com/docs/free).</w:t>
       </w:r>
     </w:p>
     <w:p>
@@ -8539,7 +8839,7 @@
           <w:color w:val="000000"/>
           <w:sz w:val="24"/>
         </w:rPr>
-        <w:t>Pendências acadêmicas: revisão do grupo, upload no Canvas e apresentação oral. Código e aplicação estão publicados. As verificações desta rodada estão em docs/VALIDACAO-FINAL.md, com evidências separadas dos dados privados. Permanecem a automação do Render e as melhorias descritas na seção 8. Testes finitos não garantem ausência de falhas, disponibilidade futura dos provedores ou substituição da avaliação do professor.</w:t>
+        <w:t>Pendências acadêmicas: revisão do grupo, upload no Canvas e apresentação oral. Cadastro/login por e-mail e recuperação de dados foram confirmados por Yuri em 30/10. O roteiro de apresentação explica GitHub, Vercel, Render, Aiven e Brevo. Código, SQL e documentação estão reunidos no pacote; credenciais e backup privado ficam fora. Não se promete disponibilidade futura dos provedores nem ausência absoluta de falhas.</w:t>
       </w:r>
     </w:p>
     <w:sectPr>

</xml_diff>